<commit_message>
añadido enlace a la página
</commit_message>
<xml_diff>
--- a/PonerBootstrap.docx
+++ b/PonerBootstrap.docx
@@ -30,6 +30,63 @@
         <w:pStyle w:val="Normal"/>
         <w:bidi w:val="0"/>
         <w:spacing w:lineRule="auto" w:line="240"/>
+        <w:jc w:val="start"/>
+        <w:rPr>
+          <w:b w:val="false"/>
+          <w:bCs w:val="false"/>
+          <w:sz w:val="32"/>
+          <w:szCs w:val="32"/>
+        </w:rPr>
+      </w:pPr>
+      <w:r>
+        <w:rPr>
+          <w:b w:val="false"/>
+          <w:bCs w:val="false"/>
+          <w:sz w:val="32"/>
+          <w:szCs w:val="32"/>
+        </w:rPr>
+      </w:r>
+    </w:p>
+    <w:p>
+      <w:pPr>
+        <w:pStyle w:val="Normal"/>
+        <w:bidi w:val="0"/>
+        <w:spacing w:lineRule="auto" w:line="240"/>
+        <w:jc w:val="start"/>
+        <w:rPr>
+          <w:b w:val="false"/>
+          <w:bCs w:val="false"/>
+          <w:sz w:val="32"/>
+          <w:szCs w:val="32"/>
+        </w:rPr>
+      </w:pPr>
+      <w:r>
+        <w:rPr>
+          <w:b w:val="false"/>
+          <w:bCs w:val="false"/>
+          <w:sz w:val="32"/>
+          <w:szCs w:val="32"/>
+        </w:rPr>
+        <w:t xml:space="preserve">Enlace a la página: </w:t>
+      </w:r>
+      <w:hyperlink r:id="rId2">
+        <w:r>
+          <w:rPr>
+            <w:rStyle w:val="Hyperlink"/>
+            <w:b w:val="false"/>
+            <w:bCs w:val="false"/>
+            <w:sz w:val="32"/>
+            <w:szCs w:val="32"/>
+          </w:rPr>
+          <w:t>https://formednumber95.github.io/ProyectoDIIW/</w:t>
+        </w:r>
+      </w:hyperlink>
+    </w:p>
+    <w:p>
+      <w:pPr>
+        <w:pStyle w:val="Normal"/>
+        <w:bidi w:val="0"/>
+        <w:spacing w:lineRule="auto" w:line="240"/>
         <w:jc w:val="center"/>
         <w:rPr>
           <w:b/>
@@ -202,7 +259,7 @@
           <w:sz w:val="28"/>
           <w:szCs w:val="28"/>
         </w:rPr>
-        <w:t>Se ha añadido un menú hamburguesa para pantallas de móvil y tablet. Al añadir esto se ha tenido que importar el js de bootstrap.bundle y al  cambiar el estilo del nav también se ha descolocado de su posicion original del header. Esta mejora se ha realizado porque con el anterior menu, los usuarios de móvil y tablet no podían navegar por la pagina ya que el menú requería de hacer hover sobre el y en móviles y tablets no se suele contar con un ratón para jacer eso.</w:t>
+        <w:t>Se ha añadido un menú hamburguesa para pantallas de móvil y tablet. Al añadir esto se ha tenido que importar el js de bootstrap.bundle y al  cambiar el estilo del nav también se ha descolocado de su posicion original del header. Esta mejora se ha realizado porque con el anterior menú, los usuarios de móvil y tablet no podían navegar por la pagina ya que el menú requería de hacer hover sobre el y en móviles y tablets no se suele contar con un ratón para jacer eso.</w:t>
       </w:r>
     </w:p>
     <w:p>
@@ -251,7 +308,7 @@
                     </pic:cNvPicPr>
                   </pic:nvPicPr>
                   <pic:blipFill>
-                    <a:blip r:embed="rId2"/>
+                    <a:blip r:embed="rId3"/>
                     <a:srcRect l="0" t="0" r="0" b="62899"/>
                     <a:stretch>
                       <a:fillRect/>
@@ -320,7 +377,7 @@
                     </pic:cNvPicPr>
                   </pic:nvPicPr>
                   <pic:blipFill>
-                    <a:blip r:embed="rId3"/>
+                    <a:blip r:embed="rId4"/>
                     <a:srcRect l="0" t="0" r="0" b="56882"/>
                     <a:stretch>
                       <a:fillRect/>
@@ -362,6 +419,28 @@
           <w:sz w:val="28"/>
           <w:szCs w:val="28"/>
         </w:rPr>
+      </w:r>
+    </w:p>
+    <w:p>
+      <w:pPr>
+        <w:pStyle w:val="Normal"/>
+        <w:bidi w:val="0"/>
+        <w:jc w:val="start"/>
+        <w:rPr>
+          <w:b w:val="false"/>
+          <w:bCs w:val="false"/>
+          <w:sz w:val="28"/>
+          <w:szCs w:val="28"/>
+        </w:rPr>
+      </w:pPr>
+      <w:r>
+        <w:rPr>
+          <w:b w:val="false"/>
+          <w:bCs w:val="false"/>
+          <w:sz w:val="28"/>
+          <w:szCs w:val="28"/>
+        </w:rPr>
+        <w:t>No se han realizado mas cambios por la dificultad que estos supondrían al generar 2 páginas dinámicamente con js</w:t>
       </w:r>
     </w:p>
     <w:sectPr>
@@ -409,6 +488,20 @@
       <w:sz w:val="24"/>
       <w:szCs w:val="24"/>
       <w:lang w:val="es-ES" w:eastAsia="zh-CN" w:bidi="hi-IN"/>
+    </w:rPr>
+  </w:style>
+  <w:style w:type="character" w:styleId="Hyperlink">
+    <w:name w:val="Hyperlink"/>
+    <w:rPr>
+      <w:color w:val="000080"/>
+      <w:u w:val="single"/>
+    </w:rPr>
+  </w:style>
+  <w:style w:type="character" w:styleId="FollowedHyperlink">
+    <w:name w:val="FollowedHyperlink"/>
+    <w:rPr>
+      <w:color w:val="800000"/>
+      <w:u w:val="single"/>
     </w:rPr>
   </w:style>
   <w:style w:type="paragraph" w:styleId="Ttulo">

</xml_diff>